<commit_message>
Community partner: GDG Ulaanbaatar (judges and mentors)
</commit_message>
<xml_diff>
--- a/docs/08-sponsor-one-pager.docx
+++ b/docs/08-sponsor-one-pager.docx
@@ -140,6 +140,22 @@
       </w:r>
       <w:r>
         <w:t xml:space="preserve">, a registered youth health NGO, which signs contracts, receives funds and issues receipts.</w:t>
+      </w:r>
+      <w:r>
+        <w:t xml:space="preserve"> </w:t>
+      </w:r>
+      <w:r>
+        <w:rPr>
+          <w:b/>
+          <w:bCs/>
+        </w:rPr>
+        <w:t xml:space="preserve">GDG Ulaanbaatar</w:t>
+      </w:r>
+      <w:r>
+        <w:t xml:space="preserve"> </w:t>
+      </w:r>
+      <w:r>
+        <w:t xml:space="preserve">(Google Developer Group Ulaanbaatar) is our community partner, providing judges and mentors.</w:t>
       </w:r>
     </w:p>
     <w:p>

</xml_diff>